<commit_message>
Simplify the listening hook and Friday game to one sentence and raised hands.
Five students show six fingers today, and Friday is five same-or-different pairs if the class listened.

Co-authored-by: Beka Tevdorashvili <bekatev@users.noreply.github.com>
</commit_message>
<xml_diff>
--- a/lesson/mosmena.docx
+++ b/lesson/mosmena.docx
@@ -14,7 +14,7 @@
           <w:color w:val="8E2F3C"/>
           <w:sz w:val="36"/>
         </w:rPr>
-        <w:t>კლასი, რომელსაც უჭირს მოსმენა</w:t>
+        <w:t>მარტივი ვარიანტი ამ კლასისთვის</w:t>
       </w:r>
     </w:p>
     <w:p>
@@ -29,7 +29,7 @@
           <w:color w:val="1C2430"/>
           <w:sz w:val="24"/>
         </w:rPr>
-        <w:t>გამრავლების თვისებები, V კლასი. ეს გაკვეთილის სლაიდებში არ შედის. დაფაზე ერთხელ იწერება და იქიდან მიდის.</w:t>
+        <w:t>გამრავლების თვისებები, V კლასი. არაფერი მზადდება წინასწარ. დაფაზე ერთი წინადადება იწერება.</w:t>
       </w:r>
     </w:p>
     <w:p>
@@ -59,7 +59,7 @@
           <w:color w:val="1C2430"/>
           <w:sz w:val="24"/>
         </w:rPr>
-        <w:t>„სამი დაკეცილი ფურცელი მაქვს. პასუხი შიგნით წერია. გავხსნი მაშინ, როცა წყვილი ორ გზას დაწერს. დაფის კუთხეში ოთხი ალამია. ოთხივე თუ დარჩა, პარასკევს ბოლო 12 წუთი თამაშია: სად დაიმალა ნამრავლი. ერთ ალამს მაშინ მოვხსნი, თუ კითხვაზე ყვირილი დაიწყო ან წყვილში ერთი წერს და მეორე გვერდზეა. ალამი თუ დაიკლო, პარასკევს თამაში აღარ იქნება.“</w:t>
+        <w:t>„დღეს თუ კითხვაზე ხელი აწიეთ და არ იყვირეთ, პარასკევს ბოლო ათი წუთი ვითამაშებთ: იგივეა თუ არა.“</w:t>
       </w:r>
     </w:p>
     <w:p>
@@ -74,7 +74,7 @@
           <w:color w:val="1C2430"/>
           <w:sz w:val="24"/>
         </w:rPr>
-        <w:t>ამას მეორედ არ ხსნი. ალამს ჩუმად ხსნი და გაკვეთილს აგრძელებ.</w:t>
+        <w:t>გაკვეთილის ბოლოს ერთხელ წყვეტ. მოუსმინეს თუ არა. მოუსმინეს, პარასკევს თამაშია. აყრილობა იყო, პარასკევს ეს ათი წუთი რვეულშია, გვ. 57.</w:t>
       </w:r>
     </w:p>
     <w:p>
@@ -104,55 +104,22 @@
           <w:color w:val="1C2430"/>
           <w:sz w:val="24"/>
         </w:rPr>
-        <w:t>სამი დაკეცილი ფურცელი, სამ სხვადასხვა ადგილას. სლაიდზე პასუხი მაინც დახურულია, ფურცელი კი ხელში გიდევს, ამიტომ თვალი იქ არის.</w:t>
+        <w:t>ხუთი მოსწავლე დგება. თითოეულს 6 თითი აქვს აწეული. კლასი ხედავს და ამბობს, სულ რამდენი თითია. ჯერ ითვლიან თითებს, მერე წერენ 5·6. ორივე 30-ია. ამით იწყება გაკვეთილი, სლაიდამდე.</w:t>
       </w:r>
     </w:p>
     <w:p>
       <w:pPr>
-        <w:spacing w:before="0" w:after="40" w:line="259" w:lineRule="auto"/>
-        <w:ind w:left="340"/>
+        <w:spacing w:before="240" w:after="80" w:line="259" w:lineRule="auto"/>
       </w:pPr>
       <w:r>
         <w:rPr>
           <w:rFonts w:ascii="Sylfaen" w:hAnsi="Sylfaen" w:cs="Sylfaen" w:eastAsia="Sylfaen"/>
-          <w:b w:val="0"/>
+          <w:b/>
           <w:i w:val="0"/>
-          <w:color w:val="1C2430"/>
-          <w:sz w:val="22"/>
+          <w:color w:val="8E2F3C"/>
+          <w:sz w:val="28"/>
         </w:rPr>
-        <w:t>•  3–8 წუთი, რვეულები. ფურცელზე წერია 30. იხსნება მას შემდეგ, რაც წყვილი დაწერს 6+6+6+6+6-ს და 5·6-ს.</w:t>
-      </w:r>
-    </w:p>
-    <w:p>
-      <w:pPr>
-        <w:spacing w:before="0" w:after="40" w:line="259" w:lineRule="auto"/>
-        <w:ind w:left="340"/>
-      </w:pPr>
-      <w:r>
-        <w:rPr>
-          <w:rFonts w:ascii="Sylfaen" w:hAnsi="Sylfaen" w:cs="Sylfaen" w:eastAsia="Sylfaen"/>
-          <w:b w:val="0"/>
-          <w:i w:val="0"/>
-          <w:color w:val="1C2430"/>
-          <w:sz w:val="22"/>
-        </w:rPr>
-        <w:t>•  19–25 წუთი, ყუთები. ფურცელზე წერია 65. იხსნება მას შემდეგ, რაც ერთი გზა მაინც დაემთხვა მეორეს: 5·(9+4) და 5·9+5·4.</w:t>
-      </w:r>
-    </w:p>
-    <w:p>
-      <w:pPr>
-        <w:spacing w:before="0" w:after="40" w:line="259" w:lineRule="auto"/>
-        <w:ind w:left="340"/>
-      </w:pPr>
-      <w:r>
-        <w:rPr>
-          <w:rFonts w:ascii="Sylfaen" w:hAnsi="Sylfaen" w:cs="Sylfaen" w:eastAsia="Sylfaen"/>
-          <w:b w:val="0"/>
-          <w:i w:val="0"/>
-          <w:color w:val="1C2430"/>
-          <w:sz w:val="22"/>
-        </w:rPr>
-        <w:t>•  25–28 წუთი, საერთო მამრავლი. ფურცელზე წერია 16a. იხსნება მას შემდეგ, რაც წყვილი დაწერს (9+7)a-ს.</w:t>
+        <w:t>პარასკევი, 10 წუთი. იგივეა თუ არა</w:t>
       </w:r>
     </w:p>
     <w:p>
@@ -167,37 +134,7 @@
           <w:color w:val="1C2430"/>
           <w:sz w:val="24"/>
         </w:rPr>
-        <w:t>ოთხი ალამი ამ ოთხ ადგილას მოწმდება: რვეულების შემდეგ, გადანაცვლებადობის შემდეგ, ყუთების შემდეგ, ასოთი ჩაწერის შემდეგ. ალამი რჩება, თუ კითხვაზე ხელი აწიეს და წყვილში ორივემ დაწერა. ერთი წინადადებაც ჰკითხე მეზობელ წყვილს: „ჩვენთანაც ეს რიცხვი გამოვიდა.“</w:t>
-      </w:r>
-    </w:p>
-    <w:p>
-      <w:pPr>
-        <w:spacing w:before="240" w:after="80" w:line="259" w:lineRule="auto"/>
-      </w:pPr>
-      <w:r>
-        <w:rPr>
-          <w:rFonts w:ascii="Sylfaen" w:hAnsi="Sylfaen" w:cs="Sylfaen" w:eastAsia="Sylfaen"/>
-          <w:b/>
-          <w:i w:val="0"/>
-          <w:color w:val="8E2F3C"/>
-          <w:sz w:val="28"/>
-        </w:rPr>
-        <w:t>პარასკევი, 12 წუთი. სად დაიმალა ნამრავლი</w:t>
-      </w:r>
-    </w:p>
-    <w:p>
-      <w:pPr>
-        <w:spacing w:before="0" w:after="120" w:line="269" w:lineRule="auto"/>
-      </w:pPr>
-      <w:r>
-        <w:rPr>
-          <w:rFonts w:ascii="Sylfaen" w:hAnsi="Sylfaen" w:cs="Sylfaen" w:eastAsia="Sylfaen"/>
-          <w:b w:val="0"/>
-          <w:i w:val="0"/>
-          <w:color w:val="1C2430"/>
-          <w:sz w:val="24"/>
-        </w:rPr>
-        <w:t>თამაში მხოლოდ მაშინ არის, თუ ოთხივე ალამი დაფაზე დარჩა. კლასი ორ გუნდად იყოფა, მწკრივების მიხედვით. პასუხი იწერება ერთ ფურცელზე, გუნდიდან ერთი კითხულობს. ყვირილით ნათქვამი პასუხი არ ითვლება და სვლა მეორე გუნდზე გადადის. ექვსი კითხვაა, თითო ერთი ქულა.</w:t>
+        <w:t>დაფაზე ორ რიცხვს წერ. კლასი ერთად პასუხობს ხელით: ორი ხელი აწეული ნიშნავს იგივეა, ერთი ხელი ნიშნავს სხვაა. მერე ერთი მოსწავლე ამბობს რიცხვს. ხუთი წყვილია, თითო წუთი საკმარისია.</w:t>
       </w:r>
     </w:p>
     <w:tbl>
@@ -260,7 +197,7 @@
         </w:tc>
         <w:tc>
           <w:tcPr>
-            <w:tcW w:type="dxa" w:w="4649"/>
+            <w:tcW w:type="dxa" w:w="4876"/>
             <w:shd w:val="clear" w:fill="1C2430"/>
             <w:tcBorders>
               <w:top w:val="single" w:sz="4" w:space="0" w:color="E7DCCB"/>
@@ -290,13 +227,13 @@
                 <w:color w:val="FFFFFF"/>
                 <w:sz w:val="22"/>
               </w:rPr>
-              <w:t>კითხვა</w:t>
+              <w:t>დაფაზე</w:t>
             </w:r>
           </w:p>
         </w:tc>
         <w:tc>
           <w:tcPr>
-            <w:tcW w:type="dxa" w:w="4195"/>
+            <w:tcW w:type="dxa" w:w="3969"/>
             <w:shd w:val="clear" w:fill="1C2430"/>
             <w:tcBorders>
               <w:top w:val="single" w:sz="4" w:space="0" w:color="E7DCCB"/>
@@ -365,7 +302,7 @@
                 <w:b/>
                 <w:i w:val="0"/>
                 <w:color w:val="1C2430"/>
-                <w:sz w:val="21"/>
+                <w:sz w:val="22"/>
               </w:rPr>
               <w:t>1</w:t>
             </w:r>
@@ -373,7 +310,7 @@
         </w:tc>
         <w:tc>
           <w:tcPr>
-            <w:tcW w:type="dxa" w:w="4649"/>
+            <w:tcW w:type="dxa" w:w="4876"/>
             <w:shd w:val="clear" w:fill="FBF6EE"/>
             <w:tcBorders>
               <w:top w:val="single" w:sz="4" w:space="0" w:color="E7DCCB"/>
@@ -401,15 +338,15 @@
                 <w:b w:val="0"/>
                 <w:i w:val="0"/>
                 <w:color w:val="1C2430"/>
-                <w:sz w:val="21"/>
+                <w:sz w:val="22"/>
               </w:rPr>
-              <w:t>6·5 და 5·6. რომელი ნამრავლია მეტი?</w:t>
+              <w:t>6·5 და 5·6</w:t>
             </w:r>
           </w:p>
         </w:tc>
         <w:tc>
           <w:tcPr>
-            <w:tcW w:type="dxa" w:w="4195"/>
+            <w:tcW w:type="dxa" w:w="3969"/>
             <w:shd w:val="clear" w:fill="FBF6EE"/>
             <w:tcBorders>
               <w:top w:val="single" w:sz="4" w:space="0" w:color="E7DCCB"/>
@@ -437,9 +374,9 @@
                 <w:b w:val="0"/>
                 <w:i w:val="0"/>
                 <w:color w:val="1C2430"/>
-                <w:sz w:val="21"/>
+                <w:sz w:val="22"/>
               </w:rPr>
-              <w:t>არც ერთი. ორივე 30-ია. გადანაცვლებადობის თვისება.</w:t>
+              <w:t>იგივეა, 30</w:t>
             </w:r>
           </w:p>
         </w:tc>
@@ -478,7 +415,7 @@
                 <w:b/>
                 <w:i w:val="0"/>
                 <w:color w:val="1C2430"/>
-                <w:sz w:val="21"/>
+                <w:sz w:val="22"/>
               </w:rPr>
               <w:t>2</w:t>
             </w:r>
@@ -486,7 +423,7 @@
         </w:tc>
         <w:tc>
           <w:tcPr>
-            <w:tcW w:type="dxa" w:w="4649"/>
+            <w:tcW w:type="dxa" w:w="4876"/>
             <w:shd w:val="clear" w:fill="FFFFFF"/>
             <w:tcBorders>
               <w:top w:val="single" w:sz="4" w:space="0" w:color="E7DCCB"/>
@@ -514,15 +451,15 @@
                 <w:b w:val="0"/>
                 <w:i w:val="0"/>
                 <w:color w:val="1C2430"/>
-                <w:sz w:val="21"/>
+                <w:sz w:val="22"/>
               </w:rPr>
-              <w:t>(3·4)·5 და 3·(4·5). რამდენი გამოდის?</w:t>
+              <w:t>7·1 და 7</w:t>
             </w:r>
           </w:p>
         </w:tc>
         <w:tc>
           <w:tcPr>
-            <w:tcW w:type="dxa" w:w="4195"/>
+            <w:tcW w:type="dxa" w:w="3969"/>
             <w:shd w:val="clear" w:fill="FFFFFF"/>
             <w:tcBorders>
               <w:top w:val="single" w:sz="4" w:space="0" w:color="E7DCCB"/>
@@ -550,9 +487,9 @@
                 <w:b w:val="0"/>
                 <w:i w:val="0"/>
                 <w:color w:val="1C2430"/>
-                <w:sz w:val="21"/>
+                <w:sz w:val="22"/>
               </w:rPr>
-              <w:t>ორივე 60. ჯუფთებადობის თვისება.</w:t>
+              <w:t>იგივეა, 7</w:t>
             </w:r>
           </w:p>
         </w:tc>
@@ -591,7 +528,7 @@
                 <w:b/>
                 <w:i w:val="0"/>
                 <w:color w:val="1C2430"/>
-                <w:sz w:val="21"/>
+                <w:sz w:val="22"/>
               </w:rPr>
               <w:t>3</w:t>
             </w:r>
@@ -599,7 +536,7 @@
         </w:tc>
         <w:tc>
           <w:tcPr>
-            <w:tcW w:type="dxa" w:w="4649"/>
+            <w:tcW w:type="dxa" w:w="4876"/>
             <w:shd w:val="clear" w:fill="FBF6EE"/>
             <w:tcBorders>
               <w:top w:val="single" w:sz="4" w:space="0" w:color="E7DCCB"/>
@@ -627,15 +564,15 @@
                 <w:b w:val="0"/>
                 <w:i w:val="0"/>
                 <w:color w:val="1C2430"/>
-                <w:sz w:val="21"/>
+                <w:sz w:val="22"/>
               </w:rPr>
-              <w:t>9·1 და 9·0. რას უდრის თითო?</w:t>
+              <w:t>7·0 და 7</w:t>
             </w:r>
           </w:p>
         </w:tc>
         <w:tc>
           <w:tcPr>
-            <w:tcW w:type="dxa" w:w="4195"/>
+            <w:tcW w:type="dxa" w:w="3969"/>
             <w:shd w:val="clear" w:fill="FBF6EE"/>
             <w:tcBorders>
               <w:top w:val="single" w:sz="4" w:space="0" w:color="E7DCCB"/>
@@ -663,9 +600,9 @@
                 <w:b w:val="0"/>
                 <w:i w:val="0"/>
                 <w:color w:val="1C2430"/>
-                <w:sz w:val="21"/>
+                <w:sz w:val="22"/>
               </w:rPr>
-              <w:t>9 და 0. ერთზე გამრავლება რიცხვს არ ცვლის. ნულზე გამრავლება ნულს იძლევა.</w:t>
+              <w:t>სხვაა, 0 და 7</w:t>
             </w:r>
           </w:p>
         </w:tc>
@@ -704,7 +641,7 @@
                 <w:b/>
                 <w:i w:val="0"/>
                 <w:color w:val="1C2430"/>
-                <w:sz w:val="21"/>
+                <w:sz w:val="22"/>
               </w:rPr>
               <w:t>4</w:t>
             </w:r>
@@ -712,7 +649,7 @@
         </w:tc>
         <w:tc>
           <w:tcPr>
-            <w:tcW w:type="dxa" w:w="4649"/>
+            <w:tcW w:type="dxa" w:w="4876"/>
             <w:shd w:val="clear" w:fill="FFFFFF"/>
             <w:tcBorders>
               <w:top w:val="single" w:sz="4" w:space="0" w:color="E7DCCB"/>
@@ -740,15 +677,15 @@
                 <w:b w:val="0"/>
                 <w:i w:val="0"/>
                 <w:color w:val="1C2430"/>
-                <w:sz w:val="21"/>
+                <w:sz w:val="22"/>
               </w:rPr>
-              <w:t>5 ყუთი, თითოში 9 და 4. ორი გზა.</w:t>
+              <w:t>(3·4)·5 და 3·(4·5)</w:t>
             </w:r>
           </w:p>
         </w:tc>
         <w:tc>
           <w:tcPr>
-            <w:tcW w:type="dxa" w:w="4195"/>
+            <w:tcW w:type="dxa" w:w="3969"/>
             <w:shd w:val="clear" w:fill="FFFFFF"/>
             <w:tcBorders>
               <w:top w:val="single" w:sz="4" w:space="0" w:color="E7DCCB"/>
@@ -776,9 +713,9 @@
                 <w:b w:val="0"/>
                 <w:i w:val="0"/>
                 <w:color w:val="1C2430"/>
-                <w:sz w:val="21"/>
+                <w:sz w:val="22"/>
               </w:rPr>
-              <w:t>5·(9+4)=65 და 5·9+5·4=65. განრიგებადობის თვისება.</w:t>
+              <w:t>იგივეა, 60</w:t>
             </w:r>
           </w:p>
         </w:tc>
@@ -817,7 +754,7 @@
                 <w:b/>
                 <w:i w:val="0"/>
                 <w:color w:val="1C2430"/>
-                <w:sz w:val="21"/>
+                <w:sz w:val="22"/>
               </w:rPr>
               <w:t>5</w:t>
             </w:r>
@@ -825,7 +762,7 @@
         </w:tc>
         <w:tc>
           <w:tcPr>
-            <w:tcW w:type="dxa" w:w="4649"/>
+            <w:tcW w:type="dxa" w:w="4876"/>
             <w:shd w:val="clear" w:fill="FBF6EE"/>
             <w:tcBorders>
               <w:top w:val="single" w:sz="4" w:space="0" w:color="E7DCCB"/>
@@ -853,15 +790,15 @@
                 <w:b w:val="0"/>
                 <w:i w:val="0"/>
                 <w:color w:val="1C2430"/>
-                <w:sz w:val="21"/>
+                <w:sz w:val="22"/>
               </w:rPr>
-              <w:t>a=3. მაშინ 4a+5a რამდენია?</w:t>
+              <w:t>5·(9+4) და 5·9+5·4</w:t>
             </w:r>
           </w:p>
         </w:tc>
         <w:tc>
           <w:tcPr>
-            <w:tcW w:type="dxa" w:w="4195"/>
+            <w:tcW w:type="dxa" w:w="3969"/>
             <w:shd w:val="clear" w:fill="FBF6EE"/>
             <w:tcBorders>
               <w:top w:val="single" w:sz="4" w:space="0" w:color="E7DCCB"/>
@@ -889,142 +826,14 @@
                 <w:b w:val="0"/>
                 <w:i w:val="0"/>
                 <w:color w:val="1C2430"/>
-                <w:sz w:val="21"/>
+                <w:sz w:val="22"/>
               </w:rPr>
-              <w:t>9a=27. საერთო მამრავლი ფრჩხილებს გარეთ გადის.</w:t>
-            </w:r>
-          </w:p>
-        </w:tc>
-      </w:tr>
-      <w:tr>
-        <w:trPr>
-          <w:cantSplit/>
-        </w:trPr>
-        <w:tc>
-          <w:tcPr>
-            <w:tcW w:type="dxa" w:w="794"/>
-            <w:shd w:val="clear" w:fill="FFFFFF"/>
-            <w:tcBorders>
-              <w:top w:val="single" w:sz="4" w:space="0" w:color="E7DCCB"/>
-              <w:left w:val="single" w:sz="4" w:space="0" w:color="E7DCCB"/>
-              <w:bottom w:val="single" w:sz="4" w:space="0" w:color="E7DCCB"/>
-              <w:right w:val="single" w:sz="4" w:space="0" w:color="E7DCCB"/>
-            </w:tcBorders>
-            <w:tcMar>
-              <w:top w:w="60" w:type="dxa"/>
-              <w:left w:w="80" w:type="dxa"/>
-              <w:bottom w:w="60" w:type="dxa"/>
-              <w:right w:w="80" w:type="dxa"/>
-            </w:tcMar>
-            <w:vAlign w:val="center"/>
-          </w:tcPr>
-          <w:p>
-            <w:pPr>
-              <w:spacing w:before="0" w:after="0" w:line="252" w:lineRule="auto"/>
-              <w:jc w:val="left"/>
-            </w:pPr>
-            <w:r/>
-            <w:r>
-              <w:rPr>
-                <w:rFonts w:ascii="Sylfaen" w:hAnsi="Sylfaen" w:cs="Sylfaen" w:eastAsia="Sylfaen"/>
-                <w:b/>
-                <w:i w:val="0"/>
-                <w:color w:val="1C2430"/>
-                <w:sz w:val="21"/>
-              </w:rPr>
-              <w:t>6</w:t>
-            </w:r>
-          </w:p>
-        </w:tc>
-        <w:tc>
-          <w:tcPr>
-            <w:tcW w:type="dxa" w:w="4649"/>
-            <w:shd w:val="clear" w:fill="FFFFFF"/>
-            <w:tcBorders>
-              <w:top w:val="single" w:sz="4" w:space="0" w:color="E7DCCB"/>
-              <w:left w:val="single" w:sz="4" w:space="0" w:color="E7DCCB"/>
-              <w:bottom w:val="single" w:sz="4" w:space="0" w:color="E7DCCB"/>
-              <w:right w:val="single" w:sz="4" w:space="0" w:color="E7DCCB"/>
-            </w:tcBorders>
-            <w:tcMar>
-              <w:top w:w="60" w:type="dxa"/>
-              <w:left w:w="80" w:type="dxa"/>
-              <w:bottom w:w="60" w:type="dxa"/>
-              <w:right w:w="80" w:type="dxa"/>
-            </w:tcMar>
-            <w:vAlign w:val="center"/>
-          </w:tcPr>
-          <w:p>
-            <w:pPr>
-              <w:spacing w:before="0" w:after="0" w:line="252" w:lineRule="auto"/>
-              <w:jc w:val="left"/>
-            </w:pPr>
-            <w:r/>
-            <w:r>
-              <w:rPr>
-                <w:rFonts w:ascii="Sylfaen" w:hAnsi="Sylfaen" w:cs="Sylfaen" w:eastAsia="Sylfaen"/>
-                <w:b w:val="0"/>
-                <w:i w:val="0"/>
-                <w:color w:val="1C2430"/>
-                <w:sz w:val="21"/>
-              </w:rPr>
-              <w:t>მაგიდაზე სამი ფურცელია: 8a, 8a=56, 8a&gt;50. ამბობ სიტყვას „ტოლობა“. გუნდიდან ერთი შეეხება ფურცელს.</w:t>
-            </w:r>
-          </w:p>
-        </w:tc>
-        <w:tc>
-          <w:tcPr>
-            <w:tcW w:type="dxa" w:w="4195"/>
-            <w:shd w:val="clear" w:fill="FFFFFF"/>
-            <w:tcBorders>
-              <w:top w:val="single" w:sz="4" w:space="0" w:color="E7DCCB"/>
-              <w:left w:val="single" w:sz="4" w:space="0" w:color="E7DCCB"/>
-              <w:bottom w:val="single" w:sz="4" w:space="0" w:color="E7DCCB"/>
-              <w:right w:val="single" w:sz="4" w:space="0" w:color="E7DCCB"/>
-            </w:tcBorders>
-            <w:tcMar>
-              <w:top w:w="60" w:type="dxa"/>
-              <w:left w:w="80" w:type="dxa"/>
-              <w:bottom w:w="60" w:type="dxa"/>
-              <w:right w:w="80" w:type="dxa"/>
-            </w:tcMar>
-            <w:vAlign w:val="center"/>
-          </w:tcPr>
-          <w:p>
-            <w:pPr>
-              <w:spacing w:before="0" w:after="0" w:line="252" w:lineRule="auto"/>
-              <w:jc w:val="left"/>
-            </w:pPr>
-            <w:r/>
-            <w:r>
-              <w:rPr>
-                <w:rFonts w:ascii="Sylfaen" w:hAnsi="Sylfaen" w:cs="Sylfaen" w:eastAsia="Sylfaen"/>
-                <w:b w:val="0"/>
-                <w:i w:val="0"/>
-                <w:color w:val="1C2430"/>
-                <w:sz w:val="21"/>
-              </w:rPr>
-              <w:t>8a=56. დანარჩენი ორი არის გამოსახულება და უტოლობა.</w:t>
+              <w:t>იგივეა, 65</w:t>
             </w:r>
           </w:p>
         </w:tc>
       </w:tr>
     </w:tbl>
-    <w:p>
-      <w:pPr>
-        <w:spacing w:before="240" w:after="80" w:line="259" w:lineRule="auto"/>
-      </w:pPr>
-      <w:r>
-        <w:rPr>
-          <w:rFonts w:ascii="Sylfaen" w:hAnsi="Sylfaen" w:cs="Sylfaen" w:eastAsia="Sylfaen"/>
-          <w:b/>
-          <w:i w:val="0"/>
-          <w:color w:val="8E2F3C"/>
-          <w:sz w:val="28"/>
-        </w:rPr>
-        <w:t>ბოლოს</w:t>
-      </w:r>
-    </w:p>
     <w:p>
       <w:pPr>
         <w:spacing w:before="0" w:after="120" w:line="269" w:lineRule="auto"/>
@@ -1037,7 +846,7 @@
           <w:color w:val="1C2430"/>
           <w:sz w:val="24"/>
         </w:rPr>
-        <w:t>მეტი ქულის მქონე გუნდი ირჩევს, ორშაბათს დაფაზე რომელი მაგალითი დაიწეროს პირველი. ალამი თუ დააკლდა, პარასკევის ეს 12 წუთი რვეულში გადის: გვ. 57, №1–№5, ჩუმად.</w:t>
+        <w:t>ბოლოს ჰკითხე: 9a+7a და 16a იგივეა თუ არა. იგივეა. ვინც იტყვის, პარასკევი ამით მთავრდება.</w:t>
       </w:r>
     </w:p>
     <w:sectPr>

</xml_diff>

<commit_message>
Set the class hook between a single trick and a ten-minute second-way game.
Three board boxes decide Friday, and each round asks only for another way to the same product.

Co-authored-by: Beka Tevdorashvili <bekatev@users.noreply.github.com>
</commit_message>
<xml_diff>
--- a/lesson/mosmena.docx
+++ b/lesson/mosmena.docx
@@ -14,7 +14,7 @@
           <w:color w:val="8E2F3C"/>
           <w:sz w:val="36"/>
         </w:rPr>
-        <w:t>მარტივი ვარიანტი ამ კლასისთვის</w:t>
+        <w:t>ამ კლასისთვის</w:t>
       </w:r>
     </w:p>
     <w:p>
@@ -29,7 +29,7 @@
           <w:color w:val="1C2430"/>
           <w:sz w:val="24"/>
         </w:rPr>
-        <w:t>გამრავლების თვისებები, V კლასი. არაფერი მზადდება წინასწარ. დაფაზე ერთი წინადადება იწერება.</w:t>
+        <w:t>გამრავლების თვისებები, V კლასი. დაფაზე სამი ცარიელი უჯრა იხატება. სლაიდში ეს არ შედის.</w:t>
       </w:r>
     </w:p>
     <w:p>
@@ -44,7 +44,7 @@
           <w:color w:val="8E2F3C"/>
           <w:sz w:val="28"/>
         </w:rPr>
-        <w:t>რას ეუბნები პირველ წუთს</w:t>
+        <w:t>პირველი წუთი</w:t>
       </w:r>
     </w:p>
     <w:p>
@@ -59,7 +59,22 @@
           <w:color w:val="1C2430"/>
           <w:sz w:val="24"/>
         </w:rPr>
-        <w:t>„დღეს თუ კითხვაზე ხელი აწიეთ და არ იყვირეთ, პარასკევს ბოლო ათი წუთი ვითამაშებთ: იგივეა თუ არა.“</w:t>
+        <w:t>„ახლა ერთ შეცდომას დავუშვებ. ვინც დაიჭერს და მეორე გზასაც დაწერს, პირველ უჯრას ვავსებთ. დღეს სამი უჯრა თუ შეივსო, პარასკევს ათი წუთი თამაშია: მეორე გზა. ყვირილზე უჯრას ვშლი.“</w:t>
+      </w:r>
+    </w:p>
+    <w:p>
+      <w:pPr>
+        <w:spacing w:before="240" w:after="80" w:line="259" w:lineRule="auto"/>
+      </w:pPr>
+      <w:r>
+        <w:rPr>
+          <w:rFonts w:ascii="Sylfaen" w:hAnsi="Sylfaen" w:cs="Sylfaen" w:eastAsia="Sylfaen"/>
+          <w:b/>
+          <w:i w:val="0"/>
+          <w:color w:val="8E2F3C"/>
+          <w:sz w:val="28"/>
+        </w:rPr>
+        <w:t>დღეს</w:t>
       </w:r>
     </w:p>
     <w:p>
@@ -74,7 +89,37 @@
           <w:color w:val="1C2430"/>
           <w:sz w:val="24"/>
         </w:rPr>
-        <w:t>გაკვეთილის ბოლოს ერთხელ წყვეტ. მოუსმინეს თუ არა. მოუსმინეს, პარასკევს თამაშია. აყრილობა იყო, პარასკევს ეს ათი წუთი რვეულშია, გვ. 57.</w:t>
+        <w:t>შეცდომა ასე ჟღერს: „ხუთ მოსწავლეს თითო 6 რვეული აქვს, ეს 6·6-ია, სულ 36.“ კლასმა უნდა თქვას, რომ მოსწავლე ხუთია, ამიტომ 5·6=30, და მეორე გზაც დაწეროს: 6+6+6+6+6. ორივე 30-ია. ამის მერე პირველი უჯრა ივსება.</w:t>
+      </w:r>
+    </w:p>
+    <w:p>
+      <w:pPr>
+        <w:spacing w:before="0" w:after="120" w:line="269" w:lineRule="auto"/>
+      </w:pPr>
+      <w:r>
+        <w:rPr>
+          <w:rFonts w:ascii="Sylfaen" w:hAnsi="Sylfaen" w:cs="Sylfaen" w:eastAsia="Sylfaen"/>
+          <w:b w:val="0"/>
+          <w:i w:val="0"/>
+          <w:color w:val="1C2430"/>
+          <w:sz w:val="24"/>
+        </w:rPr>
+        <w:t>მეორე უჯრა ივსება, როცა წყვილი თვითონ იტყვის, რომ 6·5 და 5·6 ერთი და იგივე ნამრავლია. სახელს, გადანაცვლებადობას, ამის შემდეგ ეუბნები.</w:t>
+      </w:r>
+    </w:p>
+    <w:p>
+      <w:pPr>
+        <w:spacing w:before="0" w:after="120" w:line="269" w:lineRule="auto"/>
+      </w:pPr>
+      <w:r>
+        <w:rPr>
+          <w:rFonts w:ascii="Sylfaen" w:hAnsi="Sylfaen" w:cs="Sylfaen" w:eastAsia="Sylfaen"/>
+          <w:b w:val="0"/>
+          <w:i w:val="0"/>
+          <w:color w:val="1C2430"/>
+          <w:sz w:val="24"/>
+        </w:rPr>
+        <w:t>მესამე უჯრა ივსება, როცა დაფაზე ჩნდება 7(a+c) და ვიღაც იტყვის მეორე ჩანაწერსაც, (a+c)·7. სამივე უჯრა ბოლომდე თუ გაჩერდა, პარასკევს თამაშია.</w:t>
       </w:r>
     </w:p>
     <w:p>
@@ -89,7 +134,7 @@
           <w:color w:val="8E2F3C"/>
           <w:sz w:val="28"/>
         </w:rPr>
-        <w:t>დღეს რა არის საინტერესო</w:t>
+        <w:t>პარასკევი, 10 წუთი. მეორე გზა</w:t>
       </w:r>
     </w:p>
     <w:p>
@@ -104,37 +149,7 @@
           <w:color w:val="1C2430"/>
           <w:sz w:val="24"/>
         </w:rPr>
-        <w:t>ხუთი მოსწავლე დგება. თითოეულს 6 თითი აქვს აწეული. კლასი ხედავს და ამბობს, სულ რამდენი თითია. ჯერ ითვლიან თითებს, მერე წერენ 5·6. ორივე 30-ია. ამით იწყება გაკვეთილი, სლაიდამდე.</w:t>
-      </w:r>
-    </w:p>
-    <w:p>
-      <w:pPr>
-        <w:spacing w:before="240" w:after="80" w:line="259" w:lineRule="auto"/>
-      </w:pPr>
-      <w:r>
-        <w:rPr>
-          <w:rFonts w:ascii="Sylfaen" w:hAnsi="Sylfaen" w:cs="Sylfaen" w:eastAsia="Sylfaen"/>
-          <w:b/>
-          <w:i w:val="0"/>
-          <w:color w:val="8E2F3C"/>
-          <w:sz w:val="28"/>
-        </w:rPr>
-        <w:t>პარასკევი, 10 წუთი. იგივეა თუ არა</w:t>
-      </w:r>
-    </w:p>
-    <w:p>
-      <w:pPr>
-        <w:spacing w:before="0" w:after="120" w:line="269" w:lineRule="auto"/>
-      </w:pPr>
-      <w:r>
-        <w:rPr>
-          <w:rFonts w:ascii="Sylfaen" w:hAnsi="Sylfaen" w:cs="Sylfaen" w:eastAsia="Sylfaen"/>
-          <w:b w:val="0"/>
-          <w:i w:val="0"/>
-          <w:color w:val="1C2430"/>
-          <w:sz w:val="24"/>
-        </w:rPr>
-        <w:t>დაფაზე ორ რიცხვს წერ. კლასი ერთად პასუხობს ხელით: ორი ხელი აწეული ნიშნავს იგივეა, ერთი ხელი ნიშნავს სხვაა. მერე ერთი მოსწავლე ამბობს რიცხვს. ხუთი წყვილია, თითო წუთი საკმარისია.</w:t>
+        <w:t>კლასი შუაზე იყოფა, როგორც სხედან. დაფაზე ერთ ჩანაწერს წერ. თითო მხარეს ერთი წუთი აქვს, რომ მეორე გზა დაწეროს. ხელაწეული კითხულობს. ყვირილი არ ითვლება. სწორ მეორე გზაზე მხარე ერთ ხაზს იღებს დაფაზე. ხუთი რაუნდია.</w:t>
       </w:r>
     </w:p>
     <w:tbl>
@@ -197,7 +212,7 @@
         </w:tc>
         <w:tc>
           <w:tcPr>
-            <w:tcW w:type="dxa" w:w="4876"/>
+            <w:tcW w:type="dxa" w:w="4082"/>
             <w:shd w:val="clear" w:fill="1C2430"/>
             <w:tcBorders>
               <w:top w:val="single" w:sz="4" w:space="0" w:color="E7DCCB"/>
@@ -227,13 +242,13 @@
                 <w:color w:val="FFFFFF"/>
                 <w:sz w:val="22"/>
               </w:rPr>
-              <w:t>დაფაზე</w:t>
+              <w:t>დაფაზე წერ</w:t>
             </w:r>
           </w:p>
         </w:tc>
         <w:tc>
           <w:tcPr>
-            <w:tcW w:type="dxa" w:w="3969"/>
+            <w:tcW w:type="dxa" w:w="4762"/>
             <w:shd w:val="clear" w:fill="1C2430"/>
             <w:tcBorders>
               <w:top w:val="single" w:sz="4" w:space="0" w:color="E7DCCB"/>
@@ -263,7 +278,7 @@
                 <w:color w:val="FFFFFF"/>
                 <w:sz w:val="22"/>
               </w:rPr>
-              <w:t>პასუხი</w:t>
+              <w:t>მეორე გზა</w:t>
             </w:r>
           </w:p>
         </w:tc>
@@ -310,7 +325,7 @@
         </w:tc>
         <w:tc>
           <w:tcPr>
-            <w:tcW w:type="dxa" w:w="4876"/>
+            <w:tcW w:type="dxa" w:w="4082"/>
             <w:shd w:val="clear" w:fill="FBF6EE"/>
             <w:tcBorders>
               <w:top w:val="single" w:sz="4" w:space="0" w:color="E7DCCB"/>
@@ -340,13 +355,13 @@
                 <w:color w:val="1C2430"/>
                 <w:sz w:val="22"/>
               </w:rPr>
-              <w:t>6·5 და 5·6</w:t>
+              <w:t>6+6+6+6+6</w:t>
             </w:r>
           </w:p>
         </w:tc>
         <w:tc>
           <w:tcPr>
-            <w:tcW w:type="dxa" w:w="3969"/>
+            <w:tcW w:type="dxa" w:w="4762"/>
             <w:shd w:val="clear" w:fill="FBF6EE"/>
             <w:tcBorders>
               <w:top w:val="single" w:sz="4" w:space="0" w:color="E7DCCB"/>
@@ -376,7 +391,7 @@
                 <w:color w:val="1C2430"/>
                 <w:sz w:val="22"/>
               </w:rPr>
-              <w:t>იგივეა, 30</w:t>
+              <w:t>5·6=30</w:t>
             </w:r>
           </w:p>
         </w:tc>
@@ -423,7 +438,7 @@
         </w:tc>
         <w:tc>
           <w:tcPr>
-            <w:tcW w:type="dxa" w:w="4876"/>
+            <w:tcW w:type="dxa" w:w="4082"/>
             <w:shd w:val="clear" w:fill="FFFFFF"/>
             <w:tcBorders>
               <w:top w:val="single" w:sz="4" w:space="0" w:color="E7DCCB"/>
@@ -453,13 +468,13 @@
                 <w:color w:val="1C2430"/>
                 <w:sz w:val="22"/>
               </w:rPr>
-              <w:t>7·1 და 7</w:t>
+              <w:t>6·5</w:t>
             </w:r>
           </w:p>
         </w:tc>
         <w:tc>
           <w:tcPr>
-            <w:tcW w:type="dxa" w:w="3969"/>
+            <w:tcW w:type="dxa" w:w="4762"/>
             <w:shd w:val="clear" w:fill="FFFFFF"/>
             <w:tcBorders>
               <w:top w:val="single" w:sz="4" w:space="0" w:color="E7DCCB"/>
@@ -489,7 +504,7 @@
                 <w:color w:val="1C2430"/>
                 <w:sz w:val="22"/>
               </w:rPr>
-              <w:t>იგივეა, 7</w:t>
+              <w:t>5·6=30</w:t>
             </w:r>
           </w:p>
         </w:tc>
@@ -536,7 +551,7 @@
         </w:tc>
         <w:tc>
           <w:tcPr>
-            <w:tcW w:type="dxa" w:w="4876"/>
+            <w:tcW w:type="dxa" w:w="4082"/>
             <w:shd w:val="clear" w:fill="FBF6EE"/>
             <w:tcBorders>
               <w:top w:val="single" w:sz="4" w:space="0" w:color="E7DCCB"/>
@@ -566,13 +581,13 @@
                 <w:color w:val="1C2430"/>
                 <w:sz w:val="22"/>
               </w:rPr>
-              <w:t>7·0 და 7</w:t>
+              <w:t>(3·4)·5</w:t>
             </w:r>
           </w:p>
         </w:tc>
         <w:tc>
           <w:tcPr>
-            <w:tcW w:type="dxa" w:w="3969"/>
+            <w:tcW w:type="dxa" w:w="4762"/>
             <w:shd w:val="clear" w:fill="FBF6EE"/>
             <w:tcBorders>
               <w:top w:val="single" w:sz="4" w:space="0" w:color="E7DCCB"/>
@@ -602,7 +617,7 @@
                 <w:color w:val="1C2430"/>
                 <w:sz w:val="22"/>
               </w:rPr>
-              <w:t>სხვაა, 0 და 7</w:t>
+              <w:t>3·(4·5)=60</w:t>
             </w:r>
           </w:p>
         </w:tc>
@@ -649,7 +664,7 @@
         </w:tc>
         <w:tc>
           <w:tcPr>
-            <w:tcW w:type="dxa" w:w="4876"/>
+            <w:tcW w:type="dxa" w:w="4082"/>
             <w:shd w:val="clear" w:fill="FFFFFF"/>
             <w:tcBorders>
               <w:top w:val="single" w:sz="4" w:space="0" w:color="E7DCCB"/>
@@ -679,13 +694,13 @@
                 <w:color w:val="1C2430"/>
                 <w:sz w:val="22"/>
               </w:rPr>
-              <w:t>(3·4)·5 და 3·(4·5)</w:t>
+              <w:t>5·(9+4)</w:t>
             </w:r>
           </w:p>
         </w:tc>
         <w:tc>
           <w:tcPr>
-            <w:tcW w:type="dxa" w:w="3969"/>
+            <w:tcW w:type="dxa" w:w="4762"/>
             <w:shd w:val="clear" w:fill="FFFFFF"/>
             <w:tcBorders>
               <w:top w:val="single" w:sz="4" w:space="0" w:color="E7DCCB"/>
@@ -715,7 +730,7 @@
                 <w:color w:val="1C2430"/>
                 <w:sz w:val="22"/>
               </w:rPr>
-              <w:t>იგივეა, 60</w:t>
+              <w:t>5·9+5·4=65</w:t>
             </w:r>
           </w:p>
         </w:tc>
@@ -762,7 +777,7 @@
         </w:tc>
         <w:tc>
           <w:tcPr>
-            <w:tcW w:type="dxa" w:w="4876"/>
+            <w:tcW w:type="dxa" w:w="4082"/>
             <w:shd w:val="clear" w:fill="FBF6EE"/>
             <w:tcBorders>
               <w:top w:val="single" w:sz="4" w:space="0" w:color="E7DCCB"/>
@@ -792,13 +807,13 @@
                 <w:color w:val="1C2430"/>
                 <w:sz w:val="22"/>
               </w:rPr>
-              <w:t>5·(9+4) და 5·9+5·4</w:t>
+              <w:t>9a+7a</w:t>
             </w:r>
           </w:p>
         </w:tc>
         <w:tc>
           <w:tcPr>
-            <w:tcW w:type="dxa" w:w="3969"/>
+            <w:tcW w:type="dxa" w:w="4762"/>
             <w:shd w:val="clear" w:fill="FBF6EE"/>
             <w:tcBorders>
               <w:top w:val="single" w:sz="4" w:space="0" w:color="E7DCCB"/>
@@ -828,7 +843,7 @@
                 <w:color w:val="1C2430"/>
                 <w:sz w:val="22"/>
               </w:rPr>
-              <w:t>იგივეა, 65</w:t>
+              <w:t>16a</w:t>
             </w:r>
           </w:p>
         </w:tc>
@@ -846,7 +861,7 @@
           <w:color w:val="1C2430"/>
           <w:sz w:val="24"/>
         </w:rPr>
-        <w:t>ბოლოს ჰკითხე: 9a+7a და 16a იგივეა თუ არა. იგივეა. ვინც იტყვის, პარასკევი ამით მთავრდება.</w:t>
+        <w:t>მეტი ხაზის მხარე ირჩევს, ორშაბათს დაფაზე რა დაიწეროს პირველი. უჯრა თუ დაიშალა, ეს ათი წუთი რვეულშია: გვ. 57, №1–№5.</w:t>
       </w:r>
     </w:p>
     <w:sectPr>

</xml_diff>